<commit_message>
revision de archivos y mejora de calidad del entregable
</commit_message>
<xml_diff>
--- a/otros/ejs_widgets-JorgeFernandez.docx
+++ b/otros/ejs_widgets-JorgeFernandez.docx
@@ -19,7 +19,7 @@
             <mc:AlternateContent>
               <mc:Choice Requires="wpg">
                 <w:drawing>
-                  <wp:anchor distT="0" distB="0" distL="114300" distR="114300" simplePos="0" relativeHeight="251656192" behindDoc="1" locked="0" layoutInCell="1" allowOverlap="1" wp14:anchorId="1B882B84" wp14:editId="51FA2452">
+                  <wp:anchor distT="0" distB="0" distL="114300" distR="114300" simplePos="0" relativeHeight="251656192" behindDoc="1" locked="0" layoutInCell="1" allowOverlap="1" wp14:anchorId="6C16971E" wp14:editId="39B0517C">
                     <wp:simplePos x="0" y="0"/>
                     <wp:positionH relativeFrom="page">
                       <wp:align>center</wp:align>
@@ -317,7 +317,7 @@
               </mc:Choice>
               <mc:Fallback>
                 <w:pict>
-                  <v:group w14:anchorId="1B882B84" id="Grupo 193" o:spid="_x0000_s1026" style="position:absolute;margin-left:0;margin-top:0;width:540.55pt;height:718.4pt;z-index:-251660288;mso-width-percent:882;mso-height-percent:909;mso-position-horizontal:center;mso-position-horizontal-relative:page;mso-position-vertical:center;mso-position-vertical-relative:page;mso-width-percent:882;mso-height-percent:909" coordsize="68648,91235" o:gfxdata="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">
+                  <v:group w14:anchorId="6C16971E" id="Grupo 193" o:spid="_x0000_s1026" style="position:absolute;margin-left:0;margin-top:0;width:540.55pt;height:718.4pt;z-index:-251660288;mso-width-percent:882;mso-height-percent:909;mso-position-horizontal:center;mso-position-horizontal-relative:page;mso-position-vertical:center;mso-position-vertical-relative:page;mso-width-percent:882;mso-height-percent:909" coordsize="68648,91235" o:gfxdata="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">
                     <v:rect id="Rectángulo 194" o:spid="_x0000_s1027" style="position:absolute;width:68580;height:13716;visibility:visible;mso-wrap-style:square;v-text-anchor:middle" o:gfxdata="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" fillcolor="#4f81bd [3204]" stroked="f" strokeweight="2pt"/>
                     <v:rect id="Rectángulo 195" o:spid="_x0000_s1028" style="position:absolute;top:40943;width:68580;height:50292;visibility:visible;mso-wrap-style:square;v-text-anchor:bottom" o:gfxdata="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" fillcolor="#4f81bd [3204]" stroked="f" strokeweight="2pt">
                       <v:textbox inset="36pt,57.6pt,36pt,36pt">
@@ -531,6 +531,7 @@
               <w:kern w:val="2"/>
               <w:sz w:val="24"/>
               <w:szCs w:val="24"/>
+              <w:lang w:bidi="ar-SA"/>
               <w14:ligatures w14:val="standardContextual"/>
             </w:rPr>
           </w:pPr>
@@ -543,7 +544,7 @@
           <w:r>
             <w:fldChar w:fldCharType="separate"/>
           </w:r>
-          <w:hyperlink w:anchor="_Toc243325615" w:history="1">
+          <w:hyperlink w:anchor="_Toc243639320" w:history="1">
             <w:r>
               <w:rPr>
                 <w:rStyle w:val="Hipervnculo"/>
@@ -570,7 +571,7 @@
                 <w:noProof/>
                 <w:webHidden/>
               </w:rPr>
-              <w:instrText xml:space="preserve"> PAGEREF _Toc243325615 \h </w:instrText>
+              <w:instrText xml:space="preserve"> PAGEREF _Toc243639320 \h </w:instrText>
             </w:r>
             <w:r>
               <w:rPr>
@@ -614,10 +615,11 @@
               <w:kern w:val="2"/>
               <w:sz w:val="24"/>
               <w:szCs w:val="24"/>
+              <w:lang w:bidi="ar-SA"/>
               <w14:ligatures w14:val="standardContextual"/>
             </w:rPr>
           </w:pPr>
-          <w:hyperlink w:anchor="_Toc243325616" w:history="1">
+          <w:hyperlink w:anchor="_Toc243639321" w:history="1">
             <w:r>
               <w:rPr>
                 <w:rStyle w:val="Hipervnculo"/>
@@ -644,7 +646,7 @@
                 <w:noProof/>
                 <w:webHidden/>
               </w:rPr>
-              <w:instrText xml:space="preserve"> PAGEREF _Toc243325616 \h </w:instrText>
+              <w:instrText xml:space="preserve"> PAGEREF _Toc243639321 \h </w:instrText>
             </w:r>
             <w:r>
               <w:rPr>
@@ -688,10 +690,11 @@
               <w:kern w:val="2"/>
               <w:sz w:val="24"/>
               <w:szCs w:val="24"/>
+              <w:lang w:bidi="ar-SA"/>
               <w14:ligatures w14:val="standardContextual"/>
             </w:rPr>
           </w:pPr>
-          <w:hyperlink w:anchor="_Toc243325617" w:history="1">
+          <w:hyperlink w:anchor="_Toc243639322" w:history="1">
             <w:r>
               <w:rPr>
                 <w:rStyle w:val="Hipervnculo"/>
@@ -718,7 +721,7 @@
                 <w:noProof/>
                 <w:webHidden/>
               </w:rPr>
-              <w:instrText xml:space="preserve"> PAGEREF _Toc243325617 \h </w:instrText>
+              <w:instrText xml:space="preserve"> PAGEREF _Toc243639322 \h </w:instrText>
             </w:r>
             <w:r>
               <w:rPr>
@@ -762,10 +765,11 @@
               <w:kern w:val="2"/>
               <w:sz w:val="24"/>
               <w:szCs w:val="24"/>
+              <w:lang w:bidi="ar-SA"/>
               <w14:ligatures w14:val="standardContextual"/>
             </w:rPr>
           </w:pPr>
-          <w:hyperlink w:anchor="_Toc243325618" w:history="1">
+          <w:hyperlink w:anchor="_Toc243639323" w:history="1">
             <w:r>
               <w:rPr>
                 <w:rStyle w:val="Hipervnculo"/>
@@ -792,7 +796,7 @@
                 <w:noProof/>
                 <w:webHidden/>
               </w:rPr>
-              <w:instrText xml:space="preserve"> PAGEREF _Toc243325618 \h </w:instrText>
+              <w:instrText xml:space="preserve"> PAGEREF _Toc243639323 \h </w:instrText>
             </w:r>
             <w:r>
               <w:rPr>
@@ -836,10 +840,11 @@
               <w:kern w:val="2"/>
               <w:sz w:val="24"/>
               <w:szCs w:val="24"/>
+              <w:lang w:bidi="ar-SA"/>
               <w14:ligatures w14:val="standardContextual"/>
             </w:rPr>
           </w:pPr>
-          <w:hyperlink w:anchor="_Toc243325619" w:history="1">
+          <w:hyperlink w:anchor="_Toc243639324" w:history="1">
             <w:r>
               <w:rPr>
                 <w:rStyle w:val="Hipervnculo"/>
@@ -866,7 +871,7 @@
                 <w:noProof/>
                 <w:webHidden/>
               </w:rPr>
-              <w:instrText xml:space="preserve"> PAGEREF _Toc243325619 \h </w:instrText>
+              <w:instrText xml:space="preserve"> PAGEREF _Toc243639324 \h </w:instrText>
             </w:r>
             <w:r>
               <w:rPr>
@@ -923,7 +928,7 @@
         </w:rPr>
         <w:br w:type="page"/>
       </w:r>
-      <w:bookmarkStart w:id="0" w:name="_Toc243325615"/>
+      <w:bookmarkStart w:id="0" w:name="_Toc243639320"/>
       <w:r>
         <w:rPr>
           <w:sz w:val="36"/>
@@ -1043,7 +1048,7 @@
                 <w:noProof/>
               </w:rPr>
               <w:drawing>
-                <wp:inline distT="0" distB="0" distL="0" distR="0" wp14:anchorId="04502E91" wp14:editId="13171CD0">
+                <wp:inline distT="0" distB="0" distL="0" distR="0" wp14:anchorId="3C32D7FD" wp14:editId="0594EBDE">
                   <wp:extent cx="1530000" cy="2811237"/>
                   <wp:effectExtent l="0" t="0" r="0" b="0"/>
                   <wp:docPr id="1" name="Picture 1"/>
@@ -1107,7 +1112,7 @@
                 <w:noProof/>
               </w:rPr>
               <w:drawing>
-                <wp:inline distT="0" distB="0" distL="0" distR="0" wp14:anchorId="78B90A83" wp14:editId="6DD53135">
+                <wp:inline distT="0" distB="0" distL="0" distR="0" wp14:anchorId="3D2946CA" wp14:editId="738D947D">
                   <wp:extent cx="4407578" cy="2659380"/>
                   <wp:effectExtent l="0" t="0" r="0" b="7620"/>
                   <wp:docPr id="2" name="Picture 2"/>
@@ -1200,7 +1205,7 @@
           <w:noProof/>
         </w:rPr>
         <w:drawing>
-          <wp:anchor distT="0" distB="0" distL="114300" distR="114300" simplePos="0" relativeHeight="251658240" behindDoc="0" locked="0" layoutInCell="1" allowOverlap="1" wp14:anchorId="26CDB491" wp14:editId="3C94F152">
+          <wp:anchor distT="0" distB="0" distL="114300" distR="114300" simplePos="0" relativeHeight="251658240" behindDoc="0" locked="0" layoutInCell="1" allowOverlap="1" wp14:anchorId="198668D6" wp14:editId="5470A319">
             <wp:simplePos x="0" y="0"/>
             <wp:positionH relativeFrom="column">
               <wp:posOffset>635</wp:posOffset>
@@ -1331,7 +1336,14 @@
           <w:sz w:val="24"/>
           <w:szCs w:val="28"/>
         </w:rPr>
-        <w:t xml:space="preserve">Después de enseñar mi esquema, escribí este </w:t>
+        <w:t xml:space="preserve">Antes </w:t>
+      </w:r>
+      <w:r>
+        <w:rPr>
+          <w:sz w:val="24"/>
+          <w:szCs w:val="28"/>
+        </w:rPr>
+        <w:t xml:space="preserve">de enseñar mi esquema, escribí este </w:t>
       </w:r>
       <w:proofErr w:type="spellStart"/>
       <w:r>
@@ -1347,37 +1359,86 @@
           <w:sz w:val="24"/>
           <w:szCs w:val="28"/>
         </w:rPr>
-        <w:t>: «así sería más o menos</w:t>
+        <w:t>: «</w:t>
       </w:r>
       <w:r>
         <w:rPr>
           <w:sz w:val="24"/>
           <w:szCs w:val="28"/>
         </w:rPr>
-        <w:t>,</w:t>
+        <w:t xml:space="preserve">Dame tú un esquema y </w:t>
       </w:r>
       <w:r>
         <w:rPr>
           <w:sz w:val="24"/>
           <w:szCs w:val="28"/>
         </w:rPr>
+        <w:t>cuando</w:t>
+      </w:r>
+      <w:r>
+        <w:rPr>
+          <w:sz w:val="24"/>
+          <w:szCs w:val="28"/>
+        </w:rPr>
+        <w:t xml:space="preserve"> lo hayas hecho mira </w:t>
+      </w:r>
+      <w:r>
+        <w:rPr>
+          <w:sz w:val="24"/>
+          <w:szCs w:val="28"/>
+        </w:rPr>
+        <w:t xml:space="preserve">si </w:t>
+      </w:r>
+      <w:r>
+        <w:rPr>
+          <w:sz w:val="24"/>
+          <w:szCs w:val="28"/>
+        </w:rPr>
+        <w:t>así sería más o menos</w:t>
+      </w:r>
+      <w:r>
+        <w:rPr>
+          <w:sz w:val="24"/>
+          <w:szCs w:val="28"/>
+        </w:rPr>
+        <w:t xml:space="preserve"> en la captura que puse del </w:t>
+      </w:r>
+      <w:proofErr w:type="spellStart"/>
+      <w:r>
+        <w:rPr>
+          <w:sz w:val="24"/>
+          <w:szCs w:val="28"/>
+        </w:rPr>
+        <w:t>word</w:t>
+      </w:r>
+      <w:proofErr w:type="spellEnd"/>
+      <w:r>
+        <w:rPr>
+          <w:sz w:val="24"/>
+          <w:szCs w:val="28"/>
+        </w:rPr>
+        <w:t>.</w:t>
+      </w:r>
+      <w:r>
+        <w:rPr>
+          <w:sz w:val="24"/>
+          <w:szCs w:val="28"/>
+        </w:rPr>
         <w:t xml:space="preserve"> </w:t>
       </w:r>
-      <w:proofErr w:type="gramStart"/>
       <w:r>
         <w:rPr>
           <w:sz w:val="24"/>
           <w:szCs w:val="28"/>
         </w:rPr>
-        <w:t>no?</w:t>
-      </w:r>
-      <w:proofErr w:type="gramEnd"/>
+        <w:t>N</w:t>
+      </w:r>
       <w:r>
         <w:rPr>
           <w:sz w:val="24"/>
           <w:szCs w:val="28"/>
         </w:rPr>
-        <w:t xml:space="preserve"> no s</w:t>
+        <w:t>o s</w:t>
       </w:r>
       <w:r>
         <w:rPr>
@@ -1393,13 +1454,34 @@
         </w:rPr>
         <w:t xml:space="preserve"> </w:t>
       </w:r>
+      <w:r>
+        <w:rPr>
+          <w:sz w:val="24"/>
+          <w:szCs w:val="28"/>
+        </w:rPr>
+        <w:t>cómo</w:t>
+      </w:r>
+      <w:r>
+        <w:rPr>
+          <w:sz w:val="24"/>
+          <w:szCs w:val="28"/>
+        </w:rPr>
+        <w:t xml:space="preserve"> poner</w:t>
+      </w:r>
+      <w:r>
+        <w:rPr>
+          <w:sz w:val="24"/>
+          <w:szCs w:val="28"/>
+        </w:rPr>
+        <w:t xml:space="preserve"> ese </w:t>
+      </w:r>
       <w:proofErr w:type="spellStart"/>
       <w:r>
         <w:rPr>
           <w:sz w:val="24"/>
           <w:szCs w:val="28"/>
         </w:rPr>
-        <w:t>como</w:t>
+        <w:t>div</w:t>
       </w:r>
       <w:proofErr w:type="spellEnd"/>
       <w:r>
@@ -1407,14 +1489,37 @@
           <w:sz w:val="24"/>
           <w:szCs w:val="28"/>
         </w:rPr>
-        <w:t xml:space="preserve"> poner</w:t>
-      </w:r>
+        <w:t xml:space="preserve"> con más </w:t>
+      </w:r>
+      <w:proofErr w:type="spellStart"/>
       <w:r>
         <w:rPr>
           <w:sz w:val="24"/>
           <w:szCs w:val="28"/>
         </w:rPr>
-        <w:t xml:space="preserve"> ese </w:t>
+        <w:t>divs</w:t>
+      </w:r>
+      <w:proofErr w:type="spellEnd"/>
+      <w:r>
+        <w:rPr>
+          <w:sz w:val="24"/>
+          <w:szCs w:val="28"/>
+        </w:rPr>
+        <w:t xml:space="preserve"> metidos dentro, cada uno centrado y una sola </w:t>
+      </w:r>
+      <w:r>
+        <w:rPr>
+          <w:sz w:val="24"/>
+          <w:szCs w:val="28"/>
+        </w:rPr>
+        <w:t>línea</w:t>
+      </w:r>
+      <w:r>
+        <w:rPr>
+          <w:sz w:val="24"/>
+          <w:szCs w:val="28"/>
+        </w:rPr>
+        <w:t xml:space="preserve"> de </w:t>
       </w:r>
       <w:proofErr w:type="spellStart"/>
       <w:r>
@@ -1422,7 +1527,7 @@
           <w:sz w:val="24"/>
           <w:szCs w:val="28"/>
         </w:rPr>
-        <w:t>div</w:t>
+        <w:t>divs</w:t>
       </w:r>
       <w:proofErr w:type="spellEnd"/>
       <w:r>
@@ -1430,69 +1535,7 @@
           <w:sz w:val="24"/>
           <w:szCs w:val="28"/>
         </w:rPr>
-        <w:t xml:space="preserve"> con más </w:t>
-      </w:r>
-      <w:proofErr w:type="spellStart"/>
-      <w:r>
-        <w:rPr>
-          <w:sz w:val="24"/>
-          <w:szCs w:val="28"/>
-        </w:rPr>
-        <w:t>divs</w:t>
-      </w:r>
-      <w:proofErr w:type="spellEnd"/>
-      <w:r>
-        <w:rPr>
-          <w:sz w:val="24"/>
-          <w:szCs w:val="28"/>
-        </w:rPr>
-        <w:t xml:space="preserve"> metidos dentro, cada uno centrado y una sola </w:t>
-      </w:r>
-      <w:proofErr w:type="spellStart"/>
-      <w:r>
-        <w:rPr>
-          <w:sz w:val="24"/>
-          <w:szCs w:val="28"/>
-        </w:rPr>
-        <w:t>linea</w:t>
-      </w:r>
-      <w:proofErr w:type="spellEnd"/>
-      <w:r>
-        <w:rPr>
-          <w:sz w:val="24"/>
-          <w:szCs w:val="28"/>
-        </w:rPr>
-        <w:t xml:space="preserve"> de </w:t>
-      </w:r>
-      <w:proofErr w:type="spellStart"/>
-      <w:r>
-        <w:rPr>
-          <w:sz w:val="24"/>
-          <w:szCs w:val="28"/>
-        </w:rPr>
-        <w:t>divs</w:t>
-      </w:r>
-      <w:proofErr w:type="spellEnd"/>
-      <w:r>
-        <w:rPr>
-          <w:sz w:val="24"/>
-          <w:szCs w:val="28"/>
-        </w:rPr>
-        <w:t>,</w:t>
-      </w:r>
-      <w:r>
-        <w:rPr>
-          <w:sz w:val="24"/>
-          <w:szCs w:val="28"/>
-        </w:rPr>
-        <w:t xml:space="preserve"> así quedó mi diagrama</w:t>
-      </w:r>
-      <w:r>
-        <w:rPr>
-          <w:sz w:val="24"/>
-          <w:szCs w:val="28"/>
-        </w:rPr>
-        <w:t>. Ahora proponme tú el tuyo».</w:t>
+        <w:t>».</w:t>
       </w:r>
     </w:p>
     <w:p>
@@ -1570,6 +1613,7 @@
       <w:pPr>
         <w:pStyle w:val="Ttulo3"/>
         <w:keepLines w:val="0"/>
+        <w:jc w:val="both"/>
         <w:rPr>
           <w:sz w:val="24"/>
           <w:szCs w:val="32"/>
@@ -1955,6 +1999,7 @@
           </w:tcPr>
           <w:p>
             <w:pPr>
+              <w:jc w:val="center"/>
               <w:rPr>
                 <w:sz w:val="24"/>
                 <w:szCs w:val="28"/>
@@ -1977,6 +2022,7 @@
           </w:tcPr>
           <w:p>
             <w:pPr>
+              <w:jc w:val="center"/>
               <w:rPr>
                 <w:sz w:val="24"/>
                 <w:szCs w:val="28"/>
@@ -1999,6 +2045,7 @@
           </w:tcPr>
           <w:p>
             <w:pPr>
+              <w:jc w:val="center"/>
               <w:rPr>
                 <w:sz w:val="24"/>
                 <w:szCs w:val="28"/>
@@ -2024,6 +2071,7 @@
           <w:p>
             <w:pPr>
               <w:spacing w:after="20"/>
+              <w:jc w:val="center"/>
               <w:rPr>
                 <w:sz w:val="24"/>
                 <w:szCs w:val="28"/>
@@ -2133,6 +2181,7 @@
           <w:p>
             <w:pPr>
               <w:spacing w:after="20"/>
+              <w:jc w:val="center"/>
               <w:rPr>
                 <w:sz w:val="24"/>
                 <w:szCs w:val="28"/>
@@ -2249,6 +2298,7 @@
           <w:p>
             <w:pPr>
               <w:spacing w:after="20"/>
+              <w:jc w:val="center"/>
               <w:rPr>
                 <w:sz w:val="24"/>
                 <w:szCs w:val="28"/>
@@ -2342,6 +2392,7 @@
           <w:p>
             <w:pPr>
               <w:spacing w:after="20"/>
+              <w:jc w:val="center"/>
               <w:rPr>
                 <w:sz w:val="24"/>
                 <w:szCs w:val="28"/>
@@ -2497,23 +2548,19 @@
         <w:rPr>
           <w:sz w:val="24"/>
         </w:rPr>
-        <w:t xml:space="preserve"> de la lista </w:t>
-      </w:r>
-      <w:proofErr w:type="spellStart"/>
-      <w:proofErr w:type="gramStart"/>
-      <w:r>
-        <w:rPr>
-          <w:sz w:val="24"/>
-        </w:rPr>
-        <w:t>aprovada</w:t>
-      </w:r>
-      <w:proofErr w:type="spellEnd"/>
-      <w:proofErr w:type="gramEnd"/>
-      <w:r>
-        <w:rPr>
-          <w:sz w:val="24"/>
-        </w:rPr>
-        <w:t xml:space="preserve"> pero como justifico su uso, es usable</w:t>
+        <w:t xml:space="preserve"> de la lista apro</w:t>
+      </w:r>
+      <w:r>
+        <w:rPr>
+          <w:sz w:val="24"/>
+        </w:rPr>
+        <w:t>b</w:t>
+      </w:r>
+      <w:r>
+        <w:rPr>
+          <w:sz w:val="24"/>
+        </w:rPr>
+        <w:t>ada pero como justifico su uso, es usable</w:t>
       </w:r>
       <w:r>
         <w:rPr>
@@ -2994,7 +3041,7 @@
                 <w:noProof/>
               </w:rPr>
               <w:drawing>
-                <wp:inline distT="0" distB="0" distL="0" distR="0" wp14:anchorId="38FABE0A" wp14:editId="06596B04">
+                <wp:inline distT="0" distB="0" distL="0" distR="0" wp14:anchorId="002DC942" wp14:editId="778E8DEA">
                   <wp:extent cx="1810439" cy="3823772"/>
                   <wp:effectExtent l="0" t="0" r="0" b="0"/>
                   <wp:docPr id="4" name="Picture 4"/>
@@ -3058,7 +3105,7 @@
                 <w:noProof/>
               </w:rPr>
               <w:drawing>
-                <wp:inline distT="0" distB="0" distL="0" distR="0" wp14:anchorId="2F6B22B7" wp14:editId="3C1F8B0A">
+                <wp:inline distT="0" distB="0" distL="0" distR="0" wp14:anchorId="32E738E7" wp14:editId="6B7ED78C">
                   <wp:extent cx="1810439" cy="3737263"/>
                   <wp:effectExtent l="0" t="0" r="0" b="0"/>
                   <wp:docPr id="5" name="Picture 5"/>
@@ -3248,7 +3295,7 @@
         <w:pStyle w:val="Ttulo1"/>
         <w:pageBreakBefore/>
       </w:pPr>
-      <w:bookmarkStart w:id="1" w:name="_Toc243325616"/>
+      <w:bookmarkStart w:id="1" w:name="_Toc243639321"/>
       <w:r>
         <w:rPr>
           <w:sz w:val="36"/>
@@ -3290,6 +3337,7 @@
         <w:tc>
           <w:tcPr>
             <w:tcW w:w="1416" w:type="dxa"/>
+            <w:shd w:val="clear" w:color="auto" w:fill="95B3D7" w:themeFill="accent1" w:themeFillTint="99"/>
             <w:vAlign w:val="center"/>
           </w:tcPr>
           <w:p>
@@ -3309,6 +3357,7 @@
         <w:tc>
           <w:tcPr>
             <w:tcW w:w="4081" w:type="dxa"/>
+            <w:shd w:val="clear" w:color="auto" w:fill="95B3D7" w:themeFill="accent1" w:themeFillTint="99"/>
             <w:vAlign w:val="center"/>
           </w:tcPr>
           <w:p>
@@ -3328,6 +3377,7 @@
         <w:tc>
           <w:tcPr>
             <w:tcW w:w="1448" w:type="dxa"/>
+            <w:shd w:val="clear" w:color="auto" w:fill="95B3D7" w:themeFill="accent1" w:themeFillTint="99"/>
             <w:vAlign w:val="center"/>
           </w:tcPr>
           <w:p>
@@ -3347,6 +3397,7 @@
         <w:tc>
           <w:tcPr>
             <w:tcW w:w="5123" w:type="dxa"/>
+            <w:shd w:val="clear" w:color="auto" w:fill="95B3D7" w:themeFill="accent1" w:themeFillTint="99"/>
             <w:vAlign w:val="center"/>
           </w:tcPr>
           <w:p>
@@ -4129,14 +4180,12 @@
         </w:rPr>
         <w:t xml:space="preserve"> sin enseñarle mis respuestas: «tengo que hacer el ejercicio dos, dame una tabla hecha, yo ya tengo la </w:t>
       </w:r>
-      <w:proofErr w:type="gramStart"/>
-      <w:r>
-        <w:rPr>
-          <w:sz w:val="24"/>
-        </w:rPr>
-        <w:t>mía</w:t>
-      </w:r>
-      <w:proofErr w:type="gramEnd"/>
+      <w:r>
+        <w:rPr>
+          <w:sz w:val="24"/>
+        </w:rPr>
+        <w:t>mía,</w:t>
+      </w:r>
       <w:r>
         <w:rPr>
           <w:sz w:val="24"/>
@@ -4190,6 +4239,7 @@
         <w:tc>
           <w:tcPr>
             <w:tcW w:w="907" w:type="dxa"/>
+            <w:shd w:val="clear" w:color="auto" w:fill="95B3D7" w:themeFill="accent1" w:themeFillTint="99"/>
             <w:vAlign w:val="center"/>
           </w:tcPr>
           <w:p>
@@ -4209,6 +4259,7 @@
         <w:tc>
           <w:tcPr>
             <w:tcW w:w="2438" w:type="dxa"/>
+            <w:shd w:val="clear" w:color="auto" w:fill="95B3D7" w:themeFill="accent1" w:themeFillTint="99"/>
             <w:vAlign w:val="center"/>
           </w:tcPr>
           <w:p>
@@ -4228,6 +4279,7 @@
         <w:tc>
           <w:tcPr>
             <w:tcW w:w="5613" w:type="dxa"/>
+            <w:shd w:val="clear" w:color="auto" w:fill="95B3D7" w:themeFill="accent1" w:themeFillTint="99"/>
             <w:vAlign w:val="center"/>
           </w:tcPr>
           <w:p>
@@ -4810,6 +4862,7 @@
         <w:tc>
           <w:tcPr>
             <w:tcW w:w="907" w:type="dxa"/>
+            <w:shd w:val="clear" w:color="auto" w:fill="95B3D7" w:themeFill="accent1" w:themeFillTint="99"/>
             <w:vAlign w:val="center"/>
           </w:tcPr>
           <w:p>
@@ -4829,6 +4882,7 @@
         <w:tc>
           <w:tcPr>
             <w:tcW w:w="1417" w:type="dxa"/>
+            <w:shd w:val="clear" w:color="auto" w:fill="95B3D7" w:themeFill="accent1" w:themeFillTint="99"/>
             <w:vAlign w:val="center"/>
           </w:tcPr>
           <w:p>
@@ -4848,6 +4902,7 @@
         <w:tc>
           <w:tcPr>
             <w:tcW w:w="1417" w:type="dxa"/>
+            <w:shd w:val="clear" w:color="auto" w:fill="95B3D7" w:themeFill="accent1" w:themeFillTint="99"/>
             <w:vAlign w:val="center"/>
           </w:tcPr>
           <w:p>
@@ -4867,6 +4922,7 @@
         <w:tc>
           <w:tcPr>
             <w:tcW w:w="5216" w:type="dxa"/>
+            <w:shd w:val="clear" w:color="auto" w:fill="95B3D7" w:themeFill="accent1" w:themeFillTint="99"/>
             <w:vAlign w:val="center"/>
           </w:tcPr>
           <w:p>
@@ -5421,7 +5477,7 @@
           <w:szCs w:val="24"/>
         </w:rPr>
         <w:drawing>
-          <wp:anchor distT="0" distB="0" distL="114300" distR="114300" simplePos="0" relativeHeight="251660800" behindDoc="0" locked="0" layoutInCell="1" allowOverlap="1" wp14:anchorId="2125E031" wp14:editId="45167E4F">
+          <wp:anchor distT="0" distB="0" distL="114300" distR="114300" simplePos="0" relativeHeight="251660800" behindDoc="0" locked="0" layoutInCell="1" allowOverlap="1" wp14:anchorId="7C2009B2" wp14:editId="7420EAF8">
             <wp:simplePos x="0" y="0"/>
             <wp:positionH relativeFrom="column">
               <wp:posOffset>-23495</wp:posOffset>
@@ -5811,7 +5867,7 @@
       <w:pPr>
         <w:pStyle w:val="Ttulo1"/>
       </w:pPr>
-      <w:bookmarkStart w:id="2" w:name="_Toc243325617"/>
+      <w:bookmarkStart w:id="2" w:name="_Toc243639322"/>
       <w:r>
         <w:rPr>
           <w:sz w:val="36"/>
@@ -5917,7 +5973,7 @@
           <w:noProof/>
         </w:rPr>
         <w:drawing>
-          <wp:anchor distT="0" distB="0" distL="114300" distR="114300" simplePos="0" relativeHeight="251661824" behindDoc="0" locked="0" layoutInCell="1" allowOverlap="1" wp14:anchorId="0AF8739F" wp14:editId="787842D8">
+          <wp:anchor distT="0" distB="0" distL="114300" distR="114300" simplePos="0" relativeHeight="251661824" behindDoc="0" locked="0" layoutInCell="1" allowOverlap="1" wp14:anchorId="2DE32F4B" wp14:editId="7F9A2C2E">
             <wp:simplePos x="0" y="0"/>
             <wp:positionH relativeFrom="column">
               <wp:posOffset>367030</wp:posOffset>
@@ -6350,12 +6406,13 @@
         <w:tc>
           <w:tcPr>
             <w:tcW w:w="2880" w:type="dxa"/>
+            <w:shd w:val="clear" w:color="auto" w:fill="95B3D7" w:themeFill="accent1" w:themeFillTint="99"/>
             <w:vAlign w:val="center"/>
           </w:tcPr>
           <w:p>
             <w:pPr>
               <w:spacing w:before="60" w:after="60"/>
-              <w:jc w:val="both"/>
+              <w:jc w:val="center"/>
             </w:pPr>
             <w:r>
               <w:rPr>
@@ -6369,12 +6426,13 @@
         <w:tc>
           <w:tcPr>
             <w:tcW w:w="2880" w:type="dxa"/>
+            <w:shd w:val="clear" w:color="auto" w:fill="95B3D7" w:themeFill="accent1" w:themeFillTint="99"/>
             <w:vAlign w:val="center"/>
           </w:tcPr>
           <w:p>
             <w:pPr>
               <w:spacing w:before="60" w:after="60"/>
-              <w:jc w:val="both"/>
+              <w:jc w:val="center"/>
             </w:pPr>
             <w:r>
               <w:rPr>
@@ -6388,12 +6446,13 @@
         <w:tc>
           <w:tcPr>
             <w:tcW w:w="3600" w:type="dxa"/>
+            <w:shd w:val="clear" w:color="auto" w:fill="95B3D7" w:themeFill="accent1" w:themeFillTint="99"/>
             <w:vAlign w:val="center"/>
           </w:tcPr>
           <w:p>
             <w:pPr>
               <w:spacing w:before="60" w:after="60"/>
-              <w:jc w:val="both"/>
+              <w:jc w:val="center"/>
             </w:pPr>
             <w:r>
               <w:rPr>
@@ -6817,7 +6876,7 @@
           <w:noProof/>
         </w:rPr>
         <w:drawing>
-          <wp:inline distT="0" distB="0" distL="0" distR="0" wp14:anchorId="38A95F7E" wp14:editId="54C12489">
+          <wp:inline distT="0" distB="0" distL="0" distR="0" wp14:anchorId="589DDC0B" wp14:editId="3B0F6B3C">
             <wp:extent cx="2975610" cy="1204414"/>
             <wp:effectExtent l="0" t="0" r="0" b="0"/>
             <wp:docPr id="199" name="Picture 199"/>
@@ -7004,7 +7063,7 @@
         <w:pStyle w:val="Ttulo1"/>
         <w:pageBreakBefore/>
       </w:pPr>
-      <w:bookmarkStart w:id="3" w:name="_Toc243325618"/>
+      <w:bookmarkStart w:id="3" w:name="_Toc243639323"/>
       <w:r>
         <w:rPr>
           <w:sz w:val="36"/>
@@ -7069,11 +7128,13 @@
         <w:tc>
           <w:tcPr>
             <w:tcW w:w="1728" w:type="dxa"/>
+            <w:shd w:val="clear" w:color="auto" w:fill="95B3D7" w:themeFill="accent1" w:themeFillTint="99"/>
             <w:vAlign w:val="center"/>
           </w:tcPr>
           <w:p>
             <w:pPr>
               <w:spacing w:before="60" w:after="60"/>
+              <w:jc w:val="center"/>
             </w:pPr>
             <w:r>
               <w:rPr>
@@ -7087,11 +7148,13 @@
         <w:tc>
           <w:tcPr>
             <w:tcW w:w="7632" w:type="dxa"/>
+            <w:shd w:val="clear" w:color="auto" w:fill="95B3D7" w:themeFill="accent1" w:themeFillTint="99"/>
             <w:vAlign w:val="center"/>
           </w:tcPr>
           <w:p>
             <w:pPr>
               <w:spacing w:before="60" w:after="60"/>
+              <w:jc w:val="center"/>
             </w:pPr>
             <w:r>
               <w:rPr>
@@ -7116,6 +7179,7 @@
           <w:p>
             <w:pPr>
               <w:spacing w:before="60" w:after="60"/>
+              <w:jc w:val="center"/>
             </w:pPr>
             <w:r>
               <w:rPr>
@@ -7156,6 +7220,7 @@
           <w:p>
             <w:pPr>
               <w:spacing w:before="60" w:after="60"/>
+              <w:jc w:val="center"/>
             </w:pPr>
             <w:r>
               <w:rPr>
@@ -7196,6 +7261,7 @@
           <w:p>
             <w:pPr>
               <w:spacing w:before="60" w:after="60"/>
+              <w:jc w:val="center"/>
             </w:pPr>
             <w:r>
               <w:rPr>
@@ -7236,6 +7302,7 @@
           <w:p>
             <w:pPr>
               <w:spacing w:before="60" w:after="60"/>
+              <w:jc w:val="center"/>
             </w:pPr>
             <w:r>
               <w:rPr>
@@ -7622,6 +7689,7 @@
         <w:tc>
           <w:tcPr>
             <w:tcW w:w="3888" w:type="dxa"/>
+            <w:shd w:val="clear" w:color="auto" w:fill="95B3D7" w:themeFill="accent1" w:themeFillTint="99"/>
             <w:vAlign w:val="center"/>
           </w:tcPr>
           <w:p>
@@ -7641,6 +7709,7 @@
         <w:tc>
           <w:tcPr>
             <w:tcW w:w="720" w:type="dxa"/>
+            <w:shd w:val="clear" w:color="auto" w:fill="95B3D7" w:themeFill="accent1" w:themeFillTint="99"/>
             <w:vAlign w:val="center"/>
           </w:tcPr>
           <w:p>
@@ -7660,6 +7729,7 @@
         <w:tc>
           <w:tcPr>
             <w:tcW w:w="4752" w:type="dxa"/>
+            <w:shd w:val="clear" w:color="auto" w:fill="95B3D7" w:themeFill="accent1" w:themeFillTint="99"/>
             <w:vAlign w:val="center"/>
           </w:tcPr>
           <w:p>
@@ -8227,7 +8297,21 @@
               <w:rPr>
                 <w:sz w:val="24"/>
               </w:rPr>
-              <w:t xml:space="preserve">, Column, Container, Center, </w:t>
+              <w:t xml:space="preserve">, </w:t>
+            </w:r>
+            <w:proofErr w:type="spellStart"/>
+            <w:r>
+              <w:rPr>
+                <w:sz w:val="24"/>
+              </w:rPr>
+              <w:t>Column</w:t>
+            </w:r>
+            <w:proofErr w:type="spellEnd"/>
+            <w:r>
+              <w:rPr>
+                <w:sz w:val="24"/>
+              </w:rPr>
+              <w:t xml:space="preserve">, Container, Center, </w:t>
             </w:r>
             <w:proofErr w:type="spellStart"/>
             <w:r>
@@ -8329,9 +8413,9 @@
           <w:noProof/>
         </w:rPr>
         <w:drawing>
-          <wp:inline distT="0" distB="0" distL="0" distR="0" wp14:anchorId="10A38BB7" wp14:editId="6D33AD31">
-            <wp:extent cx="4781811" cy="2525552"/>
-            <wp:effectExtent l="0" t="0" r="0" b="8255"/>
+          <wp:inline distT="0" distB="0" distL="0" distR="0" wp14:anchorId="1F32A813" wp14:editId="2DCD5077">
+            <wp:extent cx="5035463" cy="2863465"/>
+            <wp:effectExtent l="0" t="0" r="0" b="0"/>
             <wp:docPr id="6" name="Imagen 6"/>
             <wp:cNvGraphicFramePr>
               <a:graphicFrameLocks xmlns:a="http://schemas.openxmlformats.org/drawingml/2006/main" noChangeAspect="1"/>
@@ -8352,7 +8436,7 @@
                   <pic:spPr>
                     <a:xfrm>
                       <a:off x="0" y="0"/>
-                      <a:ext cx="4796144" cy="2533122"/>
+                      <a:ext cx="5096400" cy="2898117"/>
                     </a:xfrm>
                     <a:prstGeom prst="rect">
                       <a:avLst/>
@@ -8734,7 +8818,7 @@
           <w:noProof/>
         </w:rPr>
         <w:drawing>
-          <wp:inline distT="0" distB="0" distL="0" distR="0" wp14:anchorId="7288161A" wp14:editId="69C4D376">
+          <wp:inline distT="0" distB="0" distL="0" distR="0" wp14:anchorId="58B90528" wp14:editId="4D07B775">
             <wp:extent cx="3840480" cy="1645920"/>
             <wp:effectExtent l="0" t="0" r="0" b="0"/>
             <wp:docPr id="202" name="Picture 202"/>
@@ -8792,7 +8876,7 @@
           <w:noProof/>
         </w:rPr>
         <w:drawing>
-          <wp:inline distT="0" distB="0" distL="0" distR="0" wp14:anchorId="3EF144FC" wp14:editId="48F05FB2">
+          <wp:inline distT="0" distB="0" distL="0" distR="0" wp14:anchorId="3C15DADF" wp14:editId="2D7A6EE9">
             <wp:extent cx="3840480" cy="1645920"/>
             <wp:effectExtent l="0" t="0" r="0" b="0"/>
             <wp:docPr id="203" name="Picture 203"/>
@@ -8921,7 +9005,7 @@
         <w:pStyle w:val="Ttulo1"/>
         <w:pageBreakBefore/>
       </w:pPr>
-      <w:bookmarkStart w:id="4" w:name="_Toc243325619"/>
+      <w:bookmarkStart w:id="4" w:name="_Toc243639324"/>
       <w:r>
         <w:rPr>
           <w:sz w:val="36"/>
@@ -9109,6 +9193,11 @@
       </w:r>
     </w:p>
     <w:p>
+      <w:r>
+        <w:t>Concreté textos, cifras y colores para poder revisar la primera versión punto por punto. Pedí un solo StatefulWidget porque el cambio de «Seguir» a «Siguiendo» era la única interacción. El borde rayado fue una idea visual que luego descarté al ver el resultado y revisar su código.</w:t>
+      </w:r>
+    </w:p>
+    <w:p>
       <w:pPr>
         <w:pStyle w:val="Ttulo2"/>
         <w:rPr>
@@ -9131,7 +9220,7 @@
           <w:noProof/>
         </w:rPr>
         <w:drawing>
-          <wp:anchor distT="0" distB="0" distL="114300" distR="114300" simplePos="0" relativeHeight="251654656" behindDoc="0" locked="0" layoutInCell="1" allowOverlap="1" wp14:anchorId="48941BEF" wp14:editId="75008BB8">
+          <wp:anchor distT="0" distB="0" distL="114300" distR="114300" simplePos="0" relativeHeight="251654656" behindDoc="0" locked="0" layoutInCell="1" allowOverlap="1" wp14:anchorId="4CFDA893" wp14:editId="3A38F7A1">
             <wp:simplePos x="0" y="0"/>
             <wp:positionH relativeFrom="column">
               <wp:posOffset>705</wp:posOffset>
@@ -9225,6 +9314,7 @@
         <w:tc>
           <w:tcPr>
             <w:tcW w:w="3457" w:type="dxa"/>
+            <w:shd w:val="clear" w:color="auto" w:fill="95B3D7" w:themeFill="accent1" w:themeFillTint="99"/>
           </w:tcPr>
           <w:p>
             <w:pPr>
@@ -9242,6 +9332,7 @@
         <w:tc>
           <w:tcPr>
             <w:tcW w:w="3457" w:type="dxa"/>
+            <w:shd w:val="clear" w:color="auto" w:fill="95B3D7" w:themeFill="accent1" w:themeFillTint="99"/>
           </w:tcPr>
           <w:p>
             <w:pPr>
@@ -9259,6 +9350,7 @@
         <w:tc>
           <w:tcPr>
             <w:tcW w:w="3457" w:type="dxa"/>
+            <w:shd w:val="clear" w:color="auto" w:fill="95B3D7" w:themeFill="accent1" w:themeFillTint="99"/>
           </w:tcPr>
           <w:p>
             <w:pPr>
@@ -9882,7 +9974,7 @@
                 <w:noProof/>
               </w:rPr>
               <w:drawing>
-                <wp:inline distT="0" distB="0" distL="0" distR="0" wp14:anchorId="30FD0143" wp14:editId="75264512">
+                <wp:inline distT="0" distB="0" distL="0" distR="0" wp14:anchorId="3680A85E" wp14:editId="00C7DF91">
                   <wp:extent cx="2592000" cy="5760000"/>
                   <wp:effectExtent l="0" t="0" r="0" b="0"/>
                   <wp:docPr id="205" name="Picture 205"/>
@@ -9933,7 +10025,7 @@
                 <w:noProof/>
               </w:rPr>
               <w:drawing>
-                <wp:inline distT="0" distB="0" distL="0" distR="0" wp14:anchorId="5834CCA8" wp14:editId="7C9C3274">
+                <wp:inline distT="0" distB="0" distL="0" distR="0" wp14:anchorId="0ED860BF" wp14:editId="1E04332A">
                   <wp:extent cx="2592000" cy="5760000"/>
                   <wp:effectExtent l="0" t="0" r="0" b="0"/>
                   <wp:docPr id="206" name="Picture 206"/>
@@ -10050,6 +10142,7 @@
         <w:tc>
           <w:tcPr>
             <w:tcW w:w="2721" w:type="dxa"/>
+            <w:shd w:val="clear" w:color="auto" w:fill="95B3D7" w:themeFill="accent1" w:themeFillTint="99"/>
             <w:vAlign w:val="center"/>
           </w:tcPr>
           <w:p>
@@ -10069,6 +10162,7 @@
         <w:tc>
           <w:tcPr>
             <w:tcW w:w="1417" w:type="dxa"/>
+            <w:shd w:val="clear" w:color="auto" w:fill="95B3D7" w:themeFill="accent1" w:themeFillTint="99"/>
             <w:vAlign w:val="center"/>
           </w:tcPr>
           <w:p>
@@ -10088,6 +10182,7 @@
         <w:tc>
           <w:tcPr>
             <w:tcW w:w="6180" w:type="dxa"/>
+            <w:shd w:val="clear" w:color="auto" w:fill="95B3D7" w:themeFill="accent1" w:themeFillTint="99"/>
             <w:vAlign w:val="center"/>
           </w:tcPr>
           <w:p>
@@ -10669,104 +10764,328 @@
         <w:t>Dos rondas de mejora</w:t>
       </w:r>
     </w:p>
-    <w:p>
-      <w:pPr>
-        <w:pStyle w:val="Ttulo3"/>
-      </w:pPr>
-      <w:r>
-        <w:rPr>
-          <w:sz w:val="28"/>
-        </w:rPr>
-        <w:t>Primera ronda</w:t>
-      </w:r>
-    </w:p>
-    <w:p>
-      <w:pPr>
-        <w:spacing w:after="140"/>
-      </w:pPr>
-      <w:r>
-        <w:rPr>
-          <w:sz w:val="24"/>
-        </w:rPr>
-        <w:t xml:space="preserve">Pedí comentar el borde rayado: quedaba mal y no sabía explicar </w:t>
-      </w:r>
-      <w:proofErr w:type="spellStart"/>
-      <w:r>
-        <w:rPr>
-          <w:sz w:val="24"/>
-        </w:rPr>
-        <w:t>CustomPaint</w:t>
-      </w:r>
-      <w:proofErr w:type="spellEnd"/>
-      <w:r>
-        <w:rPr>
-          <w:sz w:val="24"/>
-        </w:rPr>
-        <w:t>. El círculo sencillo funciona mejor. Yo cambié también el título a «Mi Aplicación».</w:t>
-      </w:r>
-    </w:p>
-    <w:p>
-      <w:pPr>
-        <w:pStyle w:val="Ttulo3"/>
-      </w:pPr>
-      <w:r>
-        <w:rPr>
-          <w:sz w:val="28"/>
-        </w:rPr>
-        <w:t>Segunda ronda</w:t>
-      </w:r>
-    </w:p>
-    <w:p>
-      <w:pPr>
-        <w:spacing w:after="140"/>
-      </w:pPr>
-      <w:r>
-        <w:rPr>
-          <w:sz w:val="24"/>
-        </w:rPr>
-        <w:t xml:space="preserve">Mi tabla proponía cambiar la letra negra del nombre. Pedí cerrar el ejercicio manteniendo </w:t>
-      </w:r>
-      <w:proofErr w:type="spellStart"/>
-      <w:r>
-        <w:rPr>
-          <w:sz w:val="24"/>
-        </w:rPr>
-        <w:t>Expanded</w:t>
-      </w:r>
-      <w:proofErr w:type="spellEnd"/>
-      <w:r>
-        <w:rPr>
-          <w:sz w:val="24"/>
-        </w:rPr>
-        <w:t xml:space="preserve"> y </w:t>
-      </w:r>
-      <w:proofErr w:type="spellStart"/>
-      <w:r>
-        <w:rPr>
-          <w:sz w:val="24"/>
-        </w:rPr>
-        <w:t>SingleChildScrollView</w:t>
-      </w:r>
-      <w:proofErr w:type="spellEnd"/>
-      <w:r>
-        <w:rPr>
-          <w:sz w:val="24"/>
-        </w:rPr>
-        <w:t>. Las capturas muestran el resultado</w:t>
-      </w:r>
-      <w:r>
-        <w:rPr>
-          <w:sz w:val="24"/>
-        </w:rPr>
-        <w:t xml:space="preserve"> de cómo quedó la aplicación después de que Codex revisara el código y lo dejara terminado</w:t>
-      </w:r>
-      <w:r>
-        <w:rPr>
-          <w:sz w:val="24"/>
-        </w:rPr>
-        <w:t>.</w:t>
-      </w:r>
-    </w:p>
+    <w:tbl>
+      <w:tblPr>
+        <w:tblStyle w:val="Tablaconcuadrcula"/>
+        <w:tblW w:w="0" w:type="auto"/>
+        <w:jc w:val="center"/>
+        <w:tblLayout w:type="fixed"/>
+        <w:tblLook w:val="04A0" w:firstRow="1" w:lastRow="0" w:firstColumn="1" w:lastColumn="0" w:noHBand="0" w:noVBand="1"/>
+      </w:tblPr>
+      <w:tblGrid>
+        <w:gridCol w:w="1984"/>
+        <w:gridCol w:w="2948"/>
+        <w:gridCol w:w="2721"/>
+        <w:gridCol w:w="2721"/>
+      </w:tblGrid>
+      <w:tr>
+        <w:trPr>
+          <w:cantSplit/>
+          <w:jc w:val="center"/>
+        </w:trPr>
+        <w:tc>
+          <w:tcPr>
+            <w:tcW w:w="1984" w:type="dxa"/>
+            <w:shd w:val="clear" w:color="auto" w:fill="95B3D7" w:themeFill="accent1" w:themeFillTint="99"/>
+            <w:tcMar>
+              <w:top w:w="90" w:type="dxa"/>
+              <w:left w:w="90" w:type="dxa"/>
+              <w:bottom w:w="90" w:type="dxa"/>
+              <w:right w:w="90" w:type="dxa"/>
+            </w:tcMar>
+            <w:vAlign w:val="center"/>
+          </w:tcPr>
+          <w:p>
+            <w:pPr>
+              <w:spacing w:after="0"/>
+              <w:jc w:val="center"/>
+            </w:pPr>
+            <w:r>
+              <w:rPr>
+                <w:b/>
+                <w:sz w:val="22"/>
+              </w:rPr>
+              <w:t>Petición</w:t>
+            </w:r>
+          </w:p>
+        </w:tc>
+        <w:tc>
+          <w:tcPr>
+            <w:tcW w:w="2948" w:type="dxa"/>
+            <w:shd w:val="clear" w:color="auto" w:fill="95B3D7" w:themeFill="accent1" w:themeFillTint="99"/>
+            <w:tcMar>
+              <w:top w:w="90" w:type="dxa"/>
+              <w:left w:w="90" w:type="dxa"/>
+              <w:bottom w:w="90" w:type="dxa"/>
+              <w:right w:w="90" w:type="dxa"/>
+            </w:tcMar>
+            <w:vAlign w:val="center"/>
+          </w:tcPr>
+          <w:p>
+            <w:pPr>
+              <w:spacing w:after="0"/>
+              <w:jc w:val="center"/>
+            </w:pPr>
+            <w:r>
+              <w:rPr>
+                <w:b/>
+                <w:sz w:val="22"/>
+              </w:rPr>
+              <w:t>Cambio realizado</w:t>
+            </w:r>
+          </w:p>
+        </w:tc>
+        <w:tc>
+          <w:tcPr>
+            <w:tcW w:w="2721" w:type="dxa"/>
+            <w:shd w:val="clear" w:color="auto" w:fill="95B3D7" w:themeFill="accent1" w:themeFillTint="99"/>
+            <w:tcMar>
+              <w:top w:w="90" w:type="dxa"/>
+              <w:left w:w="90" w:type="dxa"/>
+              <w:bottom w:w="90" w:type="dxa"/>
+              <w:right w:w="90" w:type="dxa"/>
+            </w:tcMar>
+            <w:vAlign w:val="center"/>
+          </w:tcPr>
+          <w:p>
+            <w:pPr>
+              <w:spacing w:after="0"/>
+              <w:jc w:val="center"/>
+            </w:pPr>
+            <w:r>
+              <w:rPr>
+                <w:b/>
+                <w:sz w:val="22"/>
+              </w:rPr>
+              <w:t>Comprobación</w:t>
+            </w:r>
+          </w:p>
+        </w:tc>
+        <w:tc>
+          <w:tcPr>
+            <w:tcW w:w="2721" w:type="dxa"/>
+            <w:shd w:val="clear" w:color="auto" w:fill="95B3D7" w:themeFill="accent1" w:themeFillTint="99"/>
+            <w:tcMar>
+              <w:top w:w="90" w:type="dxa"/>
+              <w:left w:w="90" w:type="dxa"/>
+              <w:bottom w:w="90" w:type="dxa"/>
+              <w:right w:w="90" w:type="dxa"/>
+            </w:tcMar>
+            <w:vAlign w:val="center"/>
+          </w:tcPr>
+          <w:p>
+            <w:pPr>
+              <w:spacing w:after="0"/>
+              <w:jc w:val="center"/>
+            </w:pPr>
+            <w:r>
+              <w:rPr>
+                <w:b/>
+                <w:sz w:val="22"/>
+              </w:rPr>
+              <w:t>Valoración</w:t>
+            </w:r>
+          </w:p>
+        </w:tc>
+      </w:tr>
+      <w:tr>
+        <w:trPr>
+          <w:cantSplit/>
+          <w:jc w:val="center"/>
+        </w:trPr>
+        <w:tc>
+          <w:tcPr>
+            <w:tcW w:w="1984" w:type="dxa"/>
+            <w:tcMar>
+              <w:top w:w="90" w:type="dxa"/>
+              <w:left w:w="90" w:type="dxa"/>
+              <w:bottom w:w="90" w:type="dxa"/>
+              <w:right w:w="90" w:type="dxa"/>
+            </w:tcMar>
+            <w:vAlign w:val="center"/>
+          </w:tcPr>
+          <w:p>
+            <w:pPr>
+              <w:spacing w:after="0"/>
+            </w:pPr>
+            <w:r>
+              <w:rPr>
+                <w:sz w:val="22"/>
+              </w:rPr>
+              <w:t>1. Quitar el borde rayado y revisar el título.</w:t>
+            </w:r>
+          </w:p>
+        </w:tc>
+        <w:tc>
+          <w:tcPr>
+            <w:tcW w:w="2948" w:type="dxa"/>
+            <w:tcMar>
+              <w:top w:w="90" w:type="dxa"/>
+              <w:left w:w="90" w:type="dxa"/>
+              <w:bottom w:w="90" w:type="dxa"/>
+              <w:right w:w="90" w:type="dxa"/>
+            </w:tcMar>
+            <w:vAlign w:val="center"/>
+          </w:tcPr>
+          <w:p>
+            <w:pPr>
+              <w:spacing w:after="0"/>
+            </w:pPr>
+            <w:r>
+              <w:rPr>
+                <w:sz w:val="22"/>
+              </w:rPr>
+              <w:t>Quedó comentada la prueba con CustomPaint; el círculo se mantuvo. Yo cambié el título a «Mi Aplicación».</w:t>
+            </w:r>
+          </w:p>
+        </w:tc>
+        <w:tc>
+          <w:tcPr>
+            <w:tcW w:w="2721" w:type="dxa"/>
+            <w:tcMar>
+              <w:top w:w="90" w:type="dxa"/>
+              <w:left w:w="90" w:type="dxa"/>
+              <w:bottom w:w="90" w:type="dxa"/>
+              <w:right w:w="90" w:type="dxa"/>
+            </w:tcMar>
+            <w:vAlign w:val="center"/>
+          </w:tcPr>
+          <w:p>
+            <w:pPr>
+              <w:spacing w:after="0"/>
+            </w:pPr>
+            <w:r>
+              <w:rPr>
+                <w:sz w:val="22"/>
+              </w:rPr>
+              <w:t>El avatar sigue visible y el análisis de Dart no encontró problemas.</w:t>
+            </w:r>
+          </w:p>
+        </w:tc>
+        <w:tc>
+          <w:tcPr>
+            <w:tcW w:w="2721" w:type="dxa"/>
+            <w:tcMar>
+              <w:top w:w="90" w:type="dxa"/>
+              <w:left w:w="90" w:type="dxa"/>
+              <w:bottom w:w="90" w:type="dxa"/>
+              <w:right w:w="90" w:type="dxa"/>
+            </w:tcMar>
+            <w:vAlign w:val="center"/>
+          </w:tcPr>
+          <w:p>
+            <w:pPr>
+              <w:spacing w:after="0"/>
+            </w:pPr>
+            <w:r>
+              <w:rPr>
+                <w:sz w:val="22"/>
+              </w:rPr>
+              <w:t>Prefiero el círculo sencillo y puedo explicar el código que quedó activo.</w:t>
+            </w:r>
+          </w:p>
+        </w:tc>
+      </w:tr>
+      <w:tr>
+        <w:trPr>
+          <w:cantSplit/>
+          <w:jc w:val="center"/>
+        </w:trPr>
+        <w:tc>
+          <w:tcPr>
+            <w:tcW w:w="1984" w:type="dxa"/>
+            <w:shd w:val="clear" w:color="auto" w:fill="F7F9FB"/>
+            <w:tcMar>
+              <w:top w:w="90" w:type="dxa"/>
+              <w:left w:w="90" w:type="dxa"/>
+              <w:bottom w:w="90" w:type="dxa"/>
+              <w:right w:w="90" w:type="dxa"/>
+            </w:tcMar>
+            <w:vAlign w:val="center"/>
+          </w:tcPr>
+          <w:p>
+            <w:r>
+              <w:rPr>
+                <w:sz w:val="22"/>
+              </w:rPr>
+              <w:t>2. Nombre en blanco; conservar Expanded y el desplazamiento.</w:t>
+            </w:r>
+          </w:p>
+        </w:tc>
+        <w:tc>
+          <w:tcPr>
+            <w:tcW w:w="2948" w:type="dxa"/>
+            <w:shd w:val="clear" w:color="auto" w:fill="F7F9FB"/>
+            <w:tcMar>
+              <w:top w:w="90" w:type="dxa"/>
+              <w:left w:w="90" w:type="dxa"/>
+              <w:bottom w:w="90" w:type="dxa"/>
+              <w:right w:w="90" w:type="dxa"/>
+            </w:tcMar>
+            <w:vAlign w:val="center"/>
+          </w:tcPr>
+          <w:p>
+            <w:pPr>
+              <w:spacing w:after="0"/>
+            </w:pPr>
+            <w:r>
+              <w:rPr>
+                <w:sz w:val="22"/>
+              </w:rPr>
+              <w:t>Codex cambió el color del nombre. Las tres tarjetas siguen repartidas con Expanded y la pantalla conserva el desplazamiento.</w:t>
+            </w:r>
+          </w:p>
+        </w:tc>
+        <w:tc>
+          <w:tcPr>
+            <w:tcW w:w="2721" w:type="dxa"/>
+            <w:shd w:val="clear" w:color="auto" w:fill="F7F9FB"/>
+            <w:tcMar>
+              <w:top w:w="90" w:type="dxa"/>
+              <w:left w:w="90" w:type="dxa"/>
+              <w:bottom w:w="90" w:type="dxa"/>
+              <w:right w:w="90" w:type="dxa"/>
+            </w:tcMar>
+            <w:vAlign w:val="center"/>
+          </w:tcPr>
+          <w:p>
+            <w:pPr>
+              <w:spacing w:after="0"/>
+            </w:pPr>
+            <w:r>
+              <w:rPr>
+                <w:sz w:val="22"/>
+              </w:rPr>
+              <w:t>Probé «Seguir» y «Siguiendo» en el emulador y guardé una captura de cada estado.</w:t>
+            </w:r>
+          </w:p>
+        </w:tc>
+        <w:tc>
+          <w:tcPr>
+            <w:tcW w:w="2721" w:type="dxa"/>
+            <w:shd w:val="clear" w:color="auto" w:fill="F7F9FB"/>
+            <w:tcMar>
+              <w:top w:w="90" w:type="dxa"/>
+              <w:left w:w="90" w:type="dxa"/>
+              <w:bottom w:w="90" w:type="dxa"/>
+              <w:right w:w="90" w:type="dxa"/>
+            </w:tcMar>
+            <w:vAlign w:val="center"/>
+          </w:tcPr>
+          <w:p>
+            <w:pPr>
+              <w:spacing w:after="0"/>
+            </w:pPr>
+            <w:r>
+              <w:rPr>
+                <w:sz w:val="22"/>
+              </w:rPr>
+              <w:t>El nombre se lee mejor y el botón hace el cambio que pedí.</w:t>
+            </w:r>
+          </w:p>
+        </w:tc>
+      </w:tr>
+    </w:tbl>
     <w:p>
       <w:pPr>
         <w:pStyle w:val="Ttulo2"/>
@@ -10829,10 +11148,10 @@
           <w:noProof/>
         </w:rPr>
         <w:drawing>
-          <wp:inline distT="0" distB="0" distL="0" distR="0" wp14:anchorId="0F487BC9" wp14:editId="6AC19A5F">
-            <wp:extent cx="6192000" cy="4341951"/>
-            <wp:effectExtent l="0" t="0" r="0" b="0"/>
-            <wp:docPr id="207" name="Picture 207"/>
+          <wp:inline distT="0" distB="0" distL="0" distR="0" wp14:anchorId="0747BCC8" wp14:editId="2DF1287C">
+            <wp:extent cx="6584950" cy="4197350"/>
+            <wp:effectExtent l="0" t="0" r="6350" b="0"/>
+            <wp:docPr id="8" name="Imagen 8"/>
             <wp:cNvGraphicFramePr>
               <a:graphicFrameLocks xmlns:a="http://schemas.openxmlformats.org/drawingml/2006/main" noChangeAspect="1"/>
             </wp:cNvGraphicFramePr>
@@ -10840,7 +11159,7 @@
               <a:graphicData uri="http://schemas.openxmlformats.org/drawingml/2006/picture">
                 <pic:pic xmlns:pic="http://schemas.openxmlformats.org/drawingml/2006/picture">
                   <pic:nvPicPr>
-                    <pic:cNvPr id="0" name="ej5_arbol_final.png"/>
+                    <pic:cNvPr id="1" name=""/>
                     <pic:cNvPicPr/>
                   </pic:nvPicPr>
                   <pic:blipFill>
@@ -10852,7 +11171,7 @@
                   <pic:spPr>
                     <a:xfrm>
                       <a:off x="0" y="0"/>
-                      <a:ext cx="6192000" cy="4341951"/>
+                      <a:ext cx="6584950" cy="4197350"/>
                     </a:xfrm>
                     <a:prstGeom prst="rect">
                       <a:avLst/>
@@ -10886,17 +11205,33 @@
           <w:sz w:val="24"/>
           <w:szCs w:val="24"/>
         </w:rPr>
-        <w:t>Azul: widget propio sin estado. Rosa: único widget propio con estado. Gris: widget de Flutter.</w:t>
+        <w:t>Azul: widget propio sin estado. Ro</w:t>
+      </w:r>
+      <w:r>
+        <w:rPr>
+          <w:sz w:val="24"/>
+          <w:szCs w:val="24"/>
+        </w:rPr>
+        <w:t>jo</w:t>
+      </w:r>
+      <w:r>
+        <w:rPr>
+          <w:sz w:val="24"/>
+          <w:szCs w:val="24"/>
+        </w:rPr>
+        <w:t>: único widget propio con estado. Gris: widget de Flutter.</w:t>
       </w:r>
     </w:p>
     <w:p>
       <w:pPr>
         <w:pStyle w:val="Ttulo2"/>
+        <w:pageBreakBefore/>
       </w:pPr>
       <w:r>
         <w:rPr>
           <w:sz w:val="32"/>
         </w:rPr>
+        <w:lastRenderedPageBreak/>
         <w:t>Valoración de la respuesta de la IA</w:t>
       </w:r>
     </w:p>
@@ -11084,6 +11419,32 @@
         </w:rPr>
         <w:t>.</w:t>
       </w:r>
+      <w:r>
+        <w:rPr>
+          <w:sz w:val="24"/>
+        </w:rPr>
+        <w:t xml:space="preserve"> Aunque así he aprendido que siempre desde el principio se puede hacer mejor y focalizar mejor a la IA en lo que debe de hacer</w:t>
+      </w:r>
+      <w:r>
+        <w:rPr>
+          <w:sz w:val="24"/>
+        </w:rPr>
+        <w:t xml:space="preserve"> desde el primer </w:t>
+      </w:r>
+      <w:proofErr w:type="spellStart"/>
+      <w:r>
+        <w:rPr>
+          <w:sz w:val="24"/>
+        </w:rPr>
+        <w:t>prompt</w:t>
+      </w:r>
+      <w:proofErr w:type="spellEnd"/>
+      <w:r>
+        <w:rPr>
+          <w:sz w:val="24"/>
+        </w:rPr>
+        <w:t>.</w:t>
+      </w:r>
     </w:p>
     <w:p>
       <w:pPr>
@@ -11092,7 +11453,8 @@
       </w:pPr>
       <w:r>
         <w:rPr>
-          <w:sz w:val="32"/>
+          <w:sz w:val="28"/>
+          <w:szCs w:val="24"/>
         </w:rPr>
         <w:t>Conclusión</w:t>
       </w:r>

</xml_diff>